<commit_message>
Package Module 7 portfolio
</commit_message>
<xml_diff>
--- a/m7/module7_portfolio.docx
+++ b/m7/module7_portfolio.docx
@@ -25,8 +25,314 @@
       </w:r>
     </w:p>
     <w:p>
+      <w:pPr>
+        <w:spacing w:after="0"/>
+      </w:pPr>
       <w:r>
-        <w:t>Pseudocode file not found: m7/pseudo.txt</w:t>
+        <w:rPr>
+          <w:rFonts w:ascii="Courier New" w:hAnsi="Courier New"/>
+        </w:rPr>
+        <w:t>Start program</w:t>
+      </w:r>
+    </w:p>
+    <w:p>
+      <w:pPr>
+        <w:spacing w:after="0"/>
+      </w:pPr>
+      <w:r>
+        <w:rPr>
+          <w:rFonts w:ascii="Courier New" w:hAnsi="Courier New"/>
+        </w:rPr>
+      </w:r>
+    </w:p>
+    <w:p>
+      <w:pPr>
+        <w:spacing w:after="0"/>
+      </w:pPr>
+      <w:r>
+        <w:rPr>
+          <w:rFonts w:ascii="Courier New" w:hAnsi="Courier New"/>
+        </w:rPr>
+        <w:t>Set up dictionaries for course rooms, instructors, and meeting times</w:t>
+      </w:r>
+    </w:p>
+    <w:p>
+      <w:pPr>
+        <w:spacing w:after="0"/>
+      </w:pPr>
+      <w:r>
+        <w:rPr>
+          <w:rFonts w:ascii="Courier New" w:hAnsi="Courier New"/>
+        </w:rPr>
+        <w:t>Display the CSC500 Course Information System title</w:t>
+      </w:r>
+    </w:p>
+    <w:p>
+      <w:pPr>
+        <w:spacing w:after="0"/>
+      </w:pPr>
+      <w:r>
+        <w:rPr>
+          <w:rFonts w:ascii="Courier New" w:hAnsi="Courier New"/>
+        </w:rPr>
+      </w:r>
+    </w:p>
+    <w:p>
+      <w:pPr>
+        <w:spacing w:after="0"/>
+      </w:pPr>
+      <w:r>
+        <w:rPr>
+          <w:rFonts w:ascii="Courier New" w:hAnsi="Courier New"/>
+        </w:rPr>
+        <w:t>Keep asking the user for a course number until they choose X</w:t>
+      </w:r>
+    </w:p>
+    <w:p>
+      <w:pPr>
+        <w:spacing w:after="0"/>
+      </w:pPr>
+      <w:r>
+        <w:rPr>
+          <w:rFonts w:ascii="Courier New" w:hAnsi="Courier New"/>
+        </w:rPr>
+        <w:t xml:space="preserve">    Clean up the course number entered by the user</w:t>
+      </w:r>
+    </w:p>
+    <w:p>
+      <w:pPr>
+        <w:spacing w:after="0"/>
+      </w:pPr>
+      <w:r>
+        <w:rPr>
+          <w:rFonts w:ascii="Courier New" w:hAnsi="Courier New"/>
+        </w:rPr>
+      </w:r>
+    </w:p>
+    <w:p>
+      <w:pPr>
+        <w:spacing w:after="0"/>
+      </w:pPr>
+      <w:r>
+        <w:rPr>
+          <w:rFonts w:ascii="Courier New" w:hAnsi="Courier New"/>
+        </w:rPr>
+        <w:t xml:space="preserve">    If the user enters X</w:t>
+      </w:r>
+    </w:p>
+    <w:p>
+      <w:pPr>
+        <w:spacing w:after="0"/>
+      </w:pPr>
+      <w:r>
+        <w:rPr>
+          <w:rFonts w:ascii="Courier New" w:hAnsi="Courier New"/>
+        </w:rPr>
+        <w:t xml:space="preserve">        Display a thank you message</w:t>
+      </w:r>
+    </w:p>
+    <w:p>
+      <w:pPr>
+        <w:spacing w:after="0"/>
+      </w:pPr>
+      <w:r>
+        <w:rPr>
+          <w:rFonts w:ascii="Courier New" w:hAnsi="Courier New"/>
+        </w:rPr>
+        <w:t xml:space="preserve">        End the program</w:t>
+      </w:r>
+    </w:p>
+    <w:p>
+      <w:pPr>
+        <w:spacing w:after="0"/>
+      </w:pPr>
+      <w:r>
+        <w:rPr>
+          <w:rFonts w:ascii="Courier New" w:hAnsi="Courier New"/>
+        </w:rPr>
+      </w:r>
+    </w:p>
+    <w:p>
+      <w:pPr>
+        <w:spacing w:after="0"/>
+      </w:pPr>
+      <w:r>
+        <w:rPr>
+          <w:rFonts w:ascii="Courier New" w:hAnsi="Courier New"/>
+        </w:rPr>
+        <w:t xml:space="preserve">    If the course number is blank</w:t>
+      </w:r>
+    </w:p>
+    <w:p>
+      <w:pPr>
+        <w:spacing w:after="0"/>
+      </w:pPr>
+      <w:r>
+        <w:rPr>
+          <w:rFonts w:ascii="Courier New" w:hAnsi="Courier New"/>
+        </w:rPr>
+        <w:t xml:space="preserve">        Tell the user it cannot be blank</w:t>
+      </w:r>
+    </w:p>
+    <w:p>
+      <w:pPr>
+        <w:spacing w:after="0"/>
+      </w:pPr>
+      <w:r>
+        <w:rPr>
+          <w:rFonts w:ascii="Courier New" w:hAnsi="Courier New"/>
+        </w:rPr>
+        <w:t xml:space="preserve">        Ask again</w:t>
+      </w:r>
+    </w:p>
+    <w:p>
+      <w:pPr>
+        <w:spacing w:after="0"/>
+      </w:pPr>
+      <w:r>
+        <w:rPr>
+          <w:rFonts w:ascii="Courier New" w:hAnsi="Courier New"/>
+        </w:rPr>
+      </w:r>
+    </w:p>
+    <w:p>
+      <w:pPr>
+        <w:spacing w:after="0"/>
+      </w:pPr>
+      <w:r>
+        <w:rPr>
+          <w:rFonts w:ascii="Courier New" w:hAnsi="Courier New"/>
+        </w:rPr>
+        <w:t xml:space="preserve">    Check if the course number exists in all three dictionaries</w:t>
+      </w:r>
+    </w:p>
+    <w:p>
+      <w:pPr>
+        <w:spacing w:after="0"/>
+      </w:pPr>
+      <w:r>
+        <w:rPr>
+          <w:rFonts w:ascii="Courier New" w:hAnsi="Courier New"/>
+        </w:rPr>
+      </w:r>
+    </w:p>
+    <w:p>
+      <w:pPr>
+        <w:spacing w:after="0"/>
+      </w:pPr>
+      <w:r>
+        <w:rPr>
+          <w:rFonts w:ascii="Courier New" w:hAnsi="Courier New"/>
+        </w:rPr>
+        <w:t xml:space="preserve">    If the course is not found</w:t>
+      </w:r>
+    </w:p>
+    <w:p>
+      <w:pPr>
+        <w:spacing w:after="0"/>
+      </w:pPr>
+      <w:r>
+        <w:rPr>
+          <w:rFonts w:ascii="Courier New" w:hAnsi="Courier New"/>
+        </w:rPr>
+        <w:t xml:space="preserve">        Tell the user the course was not found</w:t>
+      </w:r>
+    </w:p>
+    <w:p>
+      <w:pPr>
+        <w:spacing w:after="0"/>
+      </w:pPr>
+      <w:r>
+        <w:rPr>
+          <w:rFonts w:ascii="Courier New" w:hAnsi="Courier New"/>
+        </w:rPr>
+        <w:t xml:space="preserve">        Ask for another course number</w:t>
+      </w:r>
+    </w:p>
+    <w:p>
+      <w:pPr>
+        <w:spacing w:after="0"/>
+      </w:pPr>
+      <w:r>
+        <w:rPr>
+          <w:rFonts w:ascii="Courier New" w:hAnsi="Courier New"/>
+        </w:rPr>
+      </w:r>
+    </w:p>
+    <w:p>
+      <w:pPr>
+        <w:spacing w:after="0"/>
+      </w:pPr>
+      <w:r>
+        <w:rPr>
+          <w:rFonts w:ascii="Courier New" w:hAnsi="Courier New"/>
+        </w:rPr>
+        <w:t xml:space="preserve">    Otherwise</w:t>
+      </w:r>
+    </w:p>
+    <w:p>
+      <w:pPr>
+        <w:spacing w:after="0"/>
+      </w:pPr>
+      <w:r>
+        <w:rPr>
+          <w:rFonts w:ascii="Courier New" w:hAnsi="Courier New"/>
+        </w:rPr>
+        <w:t xml:space="preserve">        Get the room number</w:t>
+      </w:r>
+    </w:p>
+    <w:p>
+      <w:pPr>
+        <w:spacing w:after="0"/>
+      </w:pPr>
+      <w:r>
+        <w:rPr>
+          <w:rFonts w:ascii="Courier New" w:hAnsi="Courier New"/>
+        </w:rPr>
+        <w:t xml:space="preserve">        Get the instructor</w:t>
+      </w:r>
+    </w:p>
+    <w:p>
+      <w:pPr>
+        <w:spacing w:after="0"/>
+      </w:pPr>
+      <w:r>
+        <w:rPr>
+          <w:rFonts w:ascii="Courier New" w:hAnsi="Courier New"/>
+        </w:rPr>
+        <w:t xml:space="preserve">        Get the meeting time</w:t>
+      </w:r>
+    </w:p>
+    <w:p>
+      <w:pPr>
+        <w:spacing w:after="0"/>
+      </w:pPr>
+      <w:r>
+        <w:rPr>
+          <w:rFonts w:ascii="Courier New" w:hAnsi="Courier New"/>
+        </w:rPr>
+        <w:t xml:space="preserve">        Display all of the course information</w:t>
+      </w:r>
+    </w:p>
+    <w:p>
+      <w:pPr>
+        <w:spacing w:after="0"/>
+      </w:pPr>
+      <w:r>
+        <w:rPr>
+          <w:rFonts w:ascii="Courier New" w:hAnsi="Courier New"/>
+        </w:rPr>
+      </w:r>
+    </w:p>
+    <w:p>
+      <w:pPr>
+        <w:spacing w:after="0"/>
+      </w:pPr>
+      <w:r>
+        <w:rPr>
+          <w:rFonts w:ascii="Courier New" w:hAnsi="Courier New"/>
+        </w:rPr>
+        <w:t>End program</w:t>
       </w:r>
     </w:p>
     <w:p>

</xml_diff>